<commit_message>
ID-AUTO-1: DOCX rendering corrections from product inspection
- Month names are fitted to their one-line date cells (run size), never split.
- Points 3 and 4 flow through the form's own continuation rows.
- Project-design organization (and SRO rows) populate the header and are required
  for readiness; the designer representative stays optional.
- Construction/internal-SC representatives no longer get an organization suffix
  (the form does not ask for it).
- Sample regenerated; template and sample rendered and inspected page by page.

Co-Authored-By: Claude Sonnet 5.5 <noreply@anthropic.com>
Claude-Session: https://claude.ai/code/session_01JpETUoA7jLBsNDrSCGwiEf
</commit_message>
<xml_diff>
--- a/docs/samples/AOSR_SAMPLE_PILOT-W01_Shtukaturka_sten.docx
+++ b/docs/samples/AOSR_SAMPLE_PILOT-W01_Shtukaturka_sten.docx
@@ -430,7 +430,7 @@
                 <w:i/>
                 <w:iCs/>
               </w:rPr>
-              <w:t xml:space="preserve">ООО «Заказчик» (ОБРАЗЕЦ), ОГРН 0000000000000, ИНН 0000000000, адрес: г. Москва, ул. Образцовая, д. 1; СРО — ОБРАЗЕЦ</w:t>
+              <w:t xml:space="preserve">ООО «Заказчик» (ОБРАЗЕЦ), ОГРН 0000000000000, ИНН 0000000000, г. Москва, ул. Образцовая, д. 1</w:t>
             </w:r>
           </w:p>
         </w:tc>
@@ -533,7 +533,7 @@
                 <w:i/>
                 <w:iCs/>
               </w:rPr>
-              <w:t> </w:t>
+              <w:t xml:space="preserve">СРО — ОБРАЗЕЦ, ОГРН 0000000000010, ИНН 0000000010</w:t>
             </w:r>
           </w:p>
         </w:tc>
@@ -744,7 +744,7 @@
                 <w:i/>
                 <w:iCs/>
               </w:rPr>
-              <w:t xml:space="preserve">ООО СЗ «Гор-Строй» (ОБРАЗЕЦ), ОГРН 0000000000001, ИНН 0000000001, адрес: г. Москва, ул. Строителей, д. 5; СРО — ОБРАЗЕЦ</w:t>
+              <w:t xml:space="preserve">ООО СЗ «Гор-Строй» (ОБРАЗЕЦ), ОГРН 0000000000001, ИНН 0000000001, г. Москва, ул. Строителей, д. 5</w:t>
             </w:r>
           </w:p>
         </w:tc>
@@ -948,7 +948,7 @@
                 <w:i/>
                 <w:iCs/>
               </w:rPr>
-              <w:t> </w:t>
+              <w:t xml:space="preserve">СРО — ОБРАЗЕЦ, ОГРН 0000000000011, ИНН 0000000011</w:t>
             </w:r>
           </w:p>
         </w:tc>
@@ -1080,6 +1080,109 @@
                 <w:i/>
                 <w:iCs/>
               </w:rPr>
+              <w:t xml:space="preserve">ООО «Проект» (ОБРАЗЕЦ), ОГРН 0000000000003, ИНН 0000000003, г. Москва, ул. Проектная, д. 9</w:t>
+            </w:r>
+          </w:p>
+        </w:tc>
+      </w:tr>
+      <w:tr>
+        <w:trPr>
+          <w:trHeight w:val="150"/>
+        </w:trPr>
+        <w:tc>
+          <w:tcPr>
+            <w:tcW w:w="10158" w:type="dxa"/>
+            <w:gridSpan w:val="20"/>
+            <w:tcBorders>
+              <w:top w:val="nil"/>
+              <w:left w:val="nil"/>
+              <w:bottom w:val="nil"/>
+              <w:right w:val="nil"/>
+            </w:tcBorders>
+            <w:shd w:val="clear" w:color="auto" w:fill="auto"/>
+            <w:vAlign w:val="center"/>
+            <w:hideMark/>
+          </w:tcPr>
+          <w:p>
+            <w:pPr>
+              <w:overflowPunct/>
+              <w:autoSpaceDE/>
+              <w:autoSpaceDN/>
+              <w:adjustRightInd/>
+              <w:jc w:val="center"/>
+              <w:textAlignment w:val="auto"/>
+              <w:rPr>
+                <w:sz w:val="12"/>
+                <w:szCs w:val="12"/>
+              </w:rPr>
+            </w:pPr>
+            <w:proofErr w:type="gramStart"/>
+            <w:r>
+              <w:rPr>
+                <w:sz w:val="12"/>
+                <w:szCs w:val="12"/>
+              </w:rPr>
+              <w:t xml:space="preserve">(фамилия, имя, отчество (последнее -  при наличии), адрес места жительства, </w:t>
+            </w:r>
+            <w:r>
+              <w:rPr>
+                <w:sz w:val="12"/>
+                <w:szCs w:val="12"/>
+              </w:rPr>
+              <w:t>ОГРНИП</w:t>
+            </w:r>
+            <w:r>
+              <w:rPr>
+                <w:sz w:val="12"/>
+                <w:szCs w:val="12"/>
+              </w:rPr>
+              <w:t xml:space="preserve">, ИНН индивидуального предпринимателя, </w:t>
+            </w:r>
+            <w:proofErr w:type="gramEnd"/>
+          </w:p>
+        </w:tc>
+      </w:tr>
+      <w:tr>
+        <w:trPr>
+          <w:trHeight w:val="240"/>
+        </w:trPr>
+        <w:tc>
+          <w:tcPr>
+            <w:tcW w:w="10158" w:type="dxa"/>
+            <w:gridSpan w:val="20"/>
+            <w:tcBorders>
+              <w:top w:val="nil"/>
+              <w:left w:val="nil"/>
+              <w:bottom w:val="single" w:sz="4" w:space="0" w:color="auto"/>
+              <w:right w:val="nil"/>
+            </w:tcBorders>
+            <w:shd w:val="clear" w:color="auto" w:fill="auto"/>
+            <w:noWrap/>
+            <w:vAlign w:val="center"/>
+            <w:hideMark/>
+          </w:tcPr>
+          <w:p>
+            <w:pPr>
+              <w:overflowPunct/>
+              <w:autoSpaceDE/>
+              <w:autoSpaceDN/>
+              <w:adjustRightInd/>
+              <w:jc w:val="center"/>
+              <w:textAlignment w:val="auto"/>
+              <w:rPr>
+                <w:b/>
+                <w:bCs/>
+                <w:i/>
+                <w:iCs/>
+              </w:rPr>
+            </w:pPr>
+            <w:r>
+              <w:rPr>
+                <w:b/>
+                <w:bCs/>
+                <w:i/>
+                <w:iCs/>
+              </w:rPr>
               <w:t> </w:t>
             </w:r>
           </w:p>
@@ -1116,29 +1219,13 @@
                 <w:szCs w:val="12"/>
               </w:rPr>
             </w:pPr>
-            <w:proofErr w:type="gramStart"/>
-            <w:r>
-              <w:rPr>
-                <w:sz w:val="12"/>
-                <w:szCs w:val="12"/>
-              </w:rPr>
-              <w:t xml:space="preserve">(фамилия, имя, отчество (последнее -  при наличии), адрес места жительства, </w:t>
-            </w:r>
-            <w:r>
-              <w:rPr>
-                <w:sz w:val="12"/>
-                <w:szCs w:val="12"/>
-              </w:rPr>
-              <w:t>ОГРНИП</w:t>
-            </w:r>
-            <w:r>
-              <w:rPr>
-                <w:sz w:val="12"/>
-                <w:szCs w:val="12"/>
-              </w:rPr>
-              <w:t xml:space="preserve">, ИНН индивидуального предпринимателя, </w:t>
-            </w:r>
-            <w:proofErr w:type="gramEnd"/>
+            <w:r>
+              <w:rPr>
+                <w:sz w:val="12"/>
+                <w:szCs w:val="12"/>
+              </w:rPr>
+              <w:t>полное и (или) сокращенное наименование,  ОГРН, ИНН, адрес юридического лица в пределах его места нахождения, телефон или факс,</w:t>
+            </w:r>
           </w:p>
         </w:tc>
       </w:tr>
@@ -1183,94 +1270,7 @@
                 <w:i/>
                 <w:iCs/>
               </w:rPr>
-              <w:t> </w:t>
-            </w:r>
-          </w:p>
-        </w:tc>
-      </w:tr>
-      <w:tr>
-        <w:trPr>
-          <w:trHeight w:val="150"/>
-        </w:trPr>
-        <w:tc>
-          <w:tcPr>
-            <w:tcW w:w="10158" w:type="dxa"/>
-            <w:gridSpan w:val="20"/>
-            <w:tcBorders>
-              <w:top w:val="nil"/>
-              <w:left w:val="nil"/>
-              <w:bottom w:val="nil"/>
-              <w:right w:val="nil"/>
-            </w:tcBorders>
-            <w:shd w:val="clear" w:color="auto" w:fill="auto"/>
-            <w:vAlign w:val="center"/>
-            <w:hideMark/>
-          </w:tcPr>
-          <w:p>
-            <w:pPr>
-              <w:overflowPunct/>
-              <w:autoSpaceDE/>
-              <w:autoSpaceDN/>
-              <w:adjustRightInd/>
-              <w:jc w:val="center"/>
-              <w:textAlignment w:val="auto"/>
-              <w:rPr>
-                <w:sz w:val="12"/>
-                <w:szCs w:val="12"/>
-              </w:rPr>
-            </w:pPr>
-            <w:r>
-              <w:rPr>
-                <w:sz w:val="12"/>
-                <w:szCs w:val="12"/>
-              </w:rPr>
-              <w:t>полное и (или) сокращенное наименование,  ОГРН, ИНН, адрес юридического лица в пределах его места нахождения, телефон или факс,</w:t>
-            </w:r>
-          </w:p>
-        </w:tc>
-      </w:tr>
-      <w:tr>
-        <w:trPr>
-          <w:trHeight w:val="240"/>
-        </w:trPr>
-        <w:tc>
-          <w:tcPr>
-            <w:tcW w:w="10158" w:type="dxa"/>
-            <w:gridSpan w:val="20"/>
-            <w:tcBorders>
-              <w:top w:val="nil"/>
-              <w:left w:val="nil"/>
-              <w:bottom w:val="single" w:sz="4" w:space="0" w:color="auto"/>
-              <w:right w:val="nil"/>
-            </w:tcBorders>
-            <w:shd w:val="clear" w:color="auto" w:fill="auto"/>
-            <w:noWrap/>
-            <w:vAlign w:val="center"/>
-            <w:hideMark/>
-          </w:tcPr>
-          <w:p>
-            <w:pPr>
-              <w:overflowPunct/>
-              <w:autoSpaceDE/>
-              <w:autoSpaceDN/>
-              <w:adjustRightInd/>
-              <w:jc w:val="center"/>
-              <w:textAlignment w:val="auto"/>
-              <w:rPr>
-                <w:b/>
-                <w:bCs/>
-                <w:i/>
-                <w:iCs/>
-              </w:rPr>
-            </w:pPr>
-            <w:r>
-              <w:rPr>
-                <w:b/>
-                <w:bCs/>
-                <w:i/>
-                <w:iCs/>
-              </w:rPr>
-              <w:t> </w:t>
+              <w:t xml:space="preserve">СРО проектировщиков — ОБРАЗЕЦ, ОГРН 0000000000004, ИНН 0000000004</w:t>
             </w:r>
           </w:p>
         </w:tc>
@@ -1762,6 +1762,8 @@
                 <w:bCs/>
                 <w:i/>
                 <w:iCs/>
+                <w:sz w:val="16"/>
+                <w:szCs w:val="16"/>
               </w:rPr>
               <w:t xml:space="preserve">сентября</w:t>
             </w:r>
@@ -2063,7 +2065,7 @@
                 <w:i/>
                 <w:iCs/>
               </w:rPr>
-              <w:t xml:space="preserve">Инженер строительного контроля заказчика, Петров Пётр Петрович, НРС С-00001, приказ № 12 от 10.01.2026 (ОБРАЗЕЦ), ООО «Заказчик» (ОБРАЗЕЦ)</w:t>
+              <w:t xml:space="preserve">Инженер СК заказчика, Петров Пётр Петрович, НРС С-00001, приказ № 12 (ОБРАЗЕЦ), ООО «Заказчик» (ОБРАЗЕЦ)</w:t>
             </w:r>
           </w:p>
         </w:tc>
@@ -2317,7 +2319,7 @@
                 <w:i/>
                 <w:iCs/>
               </w:rPr>
-              <w:t xml:space="preserve">Производитель работ, Сидоров Сидор Сидорович, приказ № 7 от 05.01.2026 (ОБРАЗЕЦ), ООО СЗ «Гор-Строй» (ОБРАЗЕЦ)</w:t>
+              <w:t xml:space="preserve">Производитель работ, Сидоров Сидор Сидорович, приказ № 7 от 05.01.2026 (ОБРАЗЕЦ)</w:t>
             </w:r>
           </w:p>
         </w:tc>
@@ -2437,7 +2439,7 @@
                 <w:iCs/>
                 <w:szCs w:val="22"/>
               </w:rPr>
-              <w:t xml:space="preserve">Инженер строительного контроля, Иванов Иван Иванович, НРС С-00002, приказ № 9 от 05.01.2026 (ОБРАЗЕЦ), ООО СЗ «Гор-Строй» (ОБРАЗЕЦ)</w:t>
+              <w:t xml:space="preserve">Инженер строительного контроля, Иванов Иван Иванович, НРС С-00002, приказ № 9 (ОБРАЗЕЦ)</w:t>
             </w:r>
           </w:p>
         </w:tc>
@@ -2741,7 +2743,7 @@
                 <w:i/>
                 <w:iCs/>
               </w:rPr>
-              <w:t xml:space="preserve">Мастер участка, Кузнецов Кузьма Кузьмич, приказ № 3 от 03.01.2026 (ОБРАЗЕЦ), ООО «Отделочник» (ОБРАЗЕЦ)</w:t>
+              <w:t xml:space="preserve">Мастер участка, Кузнецов Кузьма Кузьмич, приказ № 3 (ОБРАЗЕЦ), ООО «Отделочник» (ОБРАЗЕЦ)</w:t>
             </w:r>
           </w:p>
         </w:tc>
@@ -3405,7 +3407,7 @@
                 <w:i/>
                 <w:iCs/>
               </w:rPr>
-              <w:t xml:space="preserve">Грунтовка глубокого проникновения «ОБРАЗЕЦ» (паспорт № П-2026/114 от 20.08.2026 ООО «Производитель»); Штукатурная смесь гипсовая «ОБРАЗЕЦ» (сертификат № RU С-RU.ОБРАЗЕЦ.0001 от 15.07.2026; декларация № ЕАЭС N RU Д-RU.ОБРАЗЕЦ.0002 от 15.07.2026)</w:t>
+              <w:t> </w:t>
             </w:r>
           </w:p>
         </w:tc>
@@ -3526,7 +3528,7 @@
                 <w:i/>
                 <w:iCs/>
               </w:rPr>
-              <w:t> </w:t>
+              <w:t xml:space="preserve">Грунтовка «ОБРАЗЕЦ» (паспорт № П-2026/114 от 20.08.2026 изготовитель — ОБРАЗЕЦ); Штукатурная смесь гипсовая «ОБРАЗЕЦ» (сертификат № RU С-RU.ОБРАЗЕЦ.0001 от 15.07.2026)</w:t>
             </w:r>
           </w:p>
         </w:tc>
@@ -3695,7 +3697,7 @@
                 <w:i/>
                 <w:iCs/>
               </w:rPr>
-              <w:t xml:space="preserve">Исполнительная схема ES-001: нанесение штукатурки стен санузлов, оси 1-12/А-Ж (ОБРАЗЕЦ)</w:t>
+              <w:t> </w:t>
             </w:r>
           </w:p>
         </w:tc>
@@ -3816,7 +3818,7 @@
                 <w:i/>
                 <w:iCs/>
               </w:rPr>
-              <w:t> </w:t>
+              <w:t xml:space="preserve">Исполнительная схема ES-001: нанесение штукатурки стен санузлов, оси 1-12/А-Ж (ОБРАЗЕЦ)</w:t>
             </w:r>
           </w:p>
         </w:tc>
@@ -4061,6 +4063,8 @@
                 <w:bCs/>
                 <w:i/>
                 <w:iCs/>
+                <w:sz w:val="16"/>
+                <w:szCs w:val="16"/>
               </w:rPr>
               <w:t xml:space="preserve">сентября</w:t>
             </w:r>
@@ -4326,6 +4330,8 @@
                 <w:bCs/>
                 <w:i/>
                 <w:iCs/>
+                <w:sz w:val="16"/>
+                <w:szCs w:val="16"/>
               </w:rPr>
               <w:t xml:space="preserve">сентября</w:t>
             </w:r>
@@ -4549,7 +4555,7 @@
                 <w:i/>
                 <w:iCs/>
               </w:rPr>
-              <w:t xml:space="preserve">СП 71.13330.2017 «Изоляционные и отделочные покрытия»; СП 70.13330.2012 «Несущие и ограждающие конструкции»</w:t>
+              <w:t xml:space="preserve">СП 71.13330.2017; СП 70.13330.2012</w:t>
             </w:r>
           </w:p>
         </w:tc>

</xml_diff>